<commit_message>
v0.6 - After submitting revision
</commit_message>
<xml_diff>
--- a/2026-Jornal-Doruk-ONNX/Responses-symmetry-4315123.docx
+++ b/2026-Jornal-Doruk-ONNX/Responses-symmetry-4315123.docx
@@ -60,6 +60,13 @@
         <w:jc w:val="both"/>
       </w:pPr>
       <w:r>
+        <w:rPr>
+          <w:b/>
+          <w:bCs/>
+        </w:rPr>
+        <w:t xml:space="preserve">Comments 1: </w:t>
+      </w:r>
+      <w:r>
         <w:t>The novelty of the core methodology is limited. The main techniques employed in this work (MLP, ONNX conversion, and dynamic/static quantization) are all standard and mature technologies. Therefore, the paper appears more as an engineering optimization study rather than a methodological contribution. Although the reported reduction in inference latency to 64</w:t>
       </w:r>
       <w:r>
@@ -91,6 +98,16 @@
       <w:pPr>
         <w:jc w:val="both"/>
       </w:pPr>
+      <w:r>
+        <w:rPr>
+          <w:b/>
+          <w:bCs/>
+        </w:rPr>
+        <w:t>Response 1:</w:t>
+      </w:r>
+      <w:r>
+        <w:t xml:space="preserve"> </w:t>
+      </w:r>
       <w:r>
         <w:t>We thank the reviewer for this constructive feedback regarding the novelty and scope of our work. We agree that MLPs, ONNX conversion, and quantization (both static and dynamic) are established and mature technologies in the field of machine learning. However, we respectfully highlight that the primary methodological contribution of this work is not the creation of these individual techniques, but rather the systematic, side-by-side comparative evaluation of their combined integration within a unified reference pipeline. To the best of our knowledge, no existing literature provides such a comprehensive comparative study on a single reference model.</w:t>
       </w:r>
@@ -172,6 +189,27 @@
         <w:jc w:val="both"/>
       </w:pPr>
       <w:r>
+        <w:rPr>
+          <w:b/>
+          <w:bCs/>
+        </w:rPr>
+        <w:t xml:space="preserve">Comments </w:t>
+      </w:r>
+      <w:r>
+        <w:rPr>
+          <w:b/>
+          <w:bCs/>
+        </w:rPr>
+        <w:t>2</w:t>
+      </w:r>
+      <w:r>
+        <w:rPr>
+          <w:b/>
+          <w:bCs/>
+        </w:rPr>
+        <w:t xml:space="preserve">: </w:t>
+      </w:r>
+      <w:r>
         <w:t>Lack of end-to-end comparison with existing works. The paper only compares the proposed model under different optimization settings (Keras vs. ONNX runtime and different quantization schemes), but does not provide any comparison with existing approaches discussed in Section 2 under similar optimization conditions. In particular, for existing models beyond MLP, it remains unclear whether similar ONNX conversion and quantization pipelines would yield comparable latency improvements. Without such comparisons, it is difficult to determine whether the observed speedup originates from the proposed design itself or simply from standard deployment optimization techniques.</w:t>
       </w:r>
     </w:p>
@@ -195,6 +233,30 @@
       <w:pPr>
         <w:jc w:val="both"/>
       </w:pPr>
+      <w:r>
+        <w:rPr>
+          <w:b/>
+          <w:bCs/>
+        </w:rPr>
+        <w:t xml:space="preserve">Response </w:t>
+      </w:r>
+      <w:r>
+        <w:rPr>
+          <w:b/>
+          <w:bCs/>
+        </w:rPr>
+        <w:t>2</w:t>
+      </w:r>
+      <w:r>
+        <w:rPr>
+          <w:b/>
+          <w:bCs/>
+        </w:rPr>
+        <w:t>:</w:t>
+      </w:r>
+      <w:r>
+        <w:t xml:space="preserve"> </w:t>
+      </w:r>
       <w:r>
         <w:t>We appreciate the reviewer’s constructive critique regarding the need for an end-to-end comparative analysis with existing works to isolate the source of the observed latency improvements. We agree that comparing our findings against the models discussed in Section 2 under identical conditions would be highly valuable. However, a major challenge in this domain is that the authors of those works have not provided publicly accessible code repositories, pre-trained model weights, or sufficient implementation details to allow for an exact, fair replication on our hardware and compiler stack. Because deep learning latency is highly sensitive to hardware specifications, batch sizes, and minor compiler differences, comparing our optimized results directly against the absolute latency numbers reported in those papers would not be scientifically rigorous or fair.</w:t>
       </w:r>
@@ -304,6 +366,27 @@
         <w:jc w:val="both"/>
       </w:pPr>
       <w:r>
+        <w:rPr>
+          <w:b/>
+          <w:bCs/>
+        </w:rPr>
+        <w:t xml:space="preserve">Comments </w:t>
+      </w:r>
+      <w:r>
+        <w:rPr>
+          <w:b/>
+          <w:bCs/>
+        </w:rPr>
+        <w:t>3</w:t>
+      </w:r>
+      <w:r>
+        <w:rPr>
+          <w:b/>
+          <w:bCs/>
+        </w:rPr>
+        <w:t xml:space="preserve">: </w:t>
+      </w:r>
+      <w:r>
         <w:t>Existing IDS/DDoS studies have already reported ONNX- and quantization-based compression and acceleration techniques. Therefore, the manuscript should clearly position itself against these works. Specifically, what fundamentally enables the improvement of lower inference latency? Is the gain due to architectural design, model size, hardware configuration, or implementation details? These questions require more detailed experimental analysis and discussion.</w:t>
       </w:r>
     </w:p>
@@ -327,6 +410,30 @@
       <w:pPr>
         <w:jc w:val="both"/>
       </w:pPr>
+      <w:r>
+        <w:rPr>
+          <w:b/>
+          <w:bCs/>
+        </w:rPr>
+        <w:t xml:space="preserve">Response </w:t>
+      </w:r>
+      <w:r>
+        <w:rPr>
+          <w:b/>
+          <w:bCs/>
+        </w:rPr>
+        <w:t>3</w:t>
+      </w:r>
+      <w:r>
+        <w:rPr>
+          <w:b/>
+          <w:bCs/>
+        </w:rPr>
+        <w:t>:</w:t>
+      </w:r>
+      <w:r>
+        <w:t xml:space="preserve"> </w:t>
+      </w:r>
       <w:r>
         <w:t>We thank the reviewer for this excellent and highly constructive comment. The question of "what fundamentally enables" the ultra-low latency is critical, and we agree that positioning our work clearly against existing IDS/DDoS literature using these techniques is essential for the paper's impact.</w:t>
       </w:r>
@@ -408,6 +515,27 @@
         <w:jc w:val="both"/>
       </w:pPr>
       <w:r>
+        <w:rPr>
+          <w:b/>
+          <w:bCs/>
+        </w:rPr>
+        <w:t xml:space="preserve">Comments </w:t>
+      </w:r>
+      <w:r>
+        <w:rPr>
+          <w:b/>
+          <w:bCs/>
+        </w:rPr>
+        <w:t>4</w:t>
+      </w:r>
+      <w:r>
+        <w:rPr>
+          <w:b/>
+          <w:bCs/>
+        </w:rPr>
+        <w:t xml:space="preserve">: </w:t>
+      </w:r>
+      <w:r>
         <w:t>The paper focuses primarily on raw model inference latency. However, for practical real-time deployment, end-to-end latency (e.g., feature extraction, preprocessing, packet parsing, and flow aggregation overhead) is often more important than standalone forward-pass time. Therefore, evaluating only inference time may not sufficiently support the real-time deployment claim. The authors are encouraged to provide an end-to-end evaluation and quantify how much overall system-level latency reduction can actually be achieved under realistic deployment settings.</w:t>
       </w:r>
     </w:p>
@@ -431,6 +559,30 @@
       <w:pPr>
         <w:jc w:val="both"/>
       </w:pPr>
+      <w:r>
+        <w:rPr>
+          <w:b/>
+          <w:bCs/>
+        </w:rPr>
+        <w:t xml:space="preserve">Response </w:t>
+      </w:r>
+      <w:r>
+        <w:rPr>
+          <w:b/>
+          <w:bCs/>
+        </w:rPr>
+        <w:t>4</w:t>
+      </w:r>
+      <w:r>
+        <w:rPr>
+          <w:b/>
+          <w:bCs/>
+        </w:rPr>
+        <w:t>:</w:t>
+      </w:r>
+      <w:r>
+        <w:t xml:space="preserve"> </w:t>
+      </w:r>
       <w:r>
         <w:t>We thank the reviewer for this highly practical and insightful comment. The distinction between standalone model inference latency and total end-to-end system latency (encompassing packet parsing, feature extraction, and flow aggregation) is a crucial consideration for real-world, line-rate network deployment.</w:t>
       </w:r>
@@ -546,6 +698,27 @@
         <w:jc w:val="both"/>
       </w:pPr>
       <w:r>
+        <w:rPr>
+          <w:b/>
+          <w:bCs/>
+        </w:rPr>
+        <w:t xml:space="preserve">Comments </w:t>
+      </w:r>
+      <w:r>
+        <w:rPr>
+          <w:b/>
+          <w:bCs/>
+        </w:rPr>
+        <w:t>5</w:t>
+      </w:r>
+      <w:r>
+        <w:rPr>
+          <w:b/>
+          <w:bCs/>
+        </w:rPr>
+        <w:t xml:space="preserve">: </w:t>
+      </w:r>
+      <w:r>
         <w:t>Minor issue. In Section 3.2, the description "the ratio between the size of the submitted query and the response received" appears to be reversed.</w:t>
       </w:r>
     </w:p>
@@ -572,6 +745,30 @@
       <w:pPr>
         <w:jc w:val="both"/>
       </w:pPr>
+      <w:r>
+        <w:rPr>
+          <w:b/>
+          <w:bCs/>
+        </w:rPr>
+        <w:t xml:space="preserve">Response </w:t>
+      </w:r>
+      <w:r>
+        <w:rPr>
+          <w:b/>
+          <w:bCs/>
+        </w:rPr>
+        <w:t>5</w:t>
+      </w:r>
+      <w:r>
+        <w:rPr>
+          <w:b/>
+          <w:bCs/>
+        </w:rPr>
+        <w:t>:</w:t>
+      </w:r>
+      <w:r>
+        <w:t xml:space="preserve"> </w:t>
+      </w:r>
       <w:r>
         <w:t>We thank the reviewer for their exceptionally careful reading of our manuscript and for identifying this error. The reviewer is entirely correct; the description of the ratio was indeed reversed in our original text.</w:t>
       </w:r>
@@ -686,6 +883,13 @@
         <w:jc w:val="both"/>
       </w:pPr>
       <w:r>
+        <w:rPr>
+          <w:b/>
+          <w:bCs/>
+        </w:rPr>
+        <w:t xml:space="preserve">Comments 1: </w:t>
+      </w:r>
+      <w:r>
         <w:t>Latency measurement – The reported 64 ns is batch</w:t>
       </w:r>
       <w:r>
@@ -754,6 +958,23 @@
       <w:pPr>
         <w:jc w:val="both"/>
       </w:pPr>
+      <w:r>
+        <w:rPr>
+          <w:b/>
+          <w:bCs/>
+        </w:rPr>
+        <w:t>Response</w:t>
+      </w:r>
+      <w:r>
+        <w:rPr>
+          <w:b/>
+          <w:bCs/>
+        </w:rPr>
+        <w:t xml:space="preserve"> 1:</w:t>
+      </w:r>
+      <w:r>
+        <w:t xml:space="preserve"> </w:t>
+      </w:r>
       <w:r>
         <w:t>We thank the reviewer for this technically rigorous comment. The distinction between single-sample B = 1 latency and batch-averaged latency is indeed a critical factor when evaluating machine learning deployment paradigms.</w:t>
       </w:r>
@@ -821,6 +1042,27 @@
         <w:jc w:val="both"/>
       </w:pPr>
       <w:r>
+        <w:rPr>
+          <w:b/>
+          <w:bCs/>
+        </w:rPr>
+        <w:t xml:space="preserve">Comments </w:t>
+      </w:r>
+      <w:r>
+        <w:rPr>
+          <w:b/>
+          <w:bCs/>
+        </w:rPr>
+        <w:t>2</w:t>
+      </w:r>
+      <w:r>
+        <w:rPr>
+          <w:b/>
+          <w:bCs/>
+        </w:rPr>
+        <w:t xml:space="preserve">: </w:t>
+      </w:r>
+      <w:r>
         <w:t>Baseline comparisons – Add at least two alternative lightweight detectors (e.g., pruned MLP, 1D</w:t>
       </w:r>
       <w:r>
@@ -863,6 +1105,34 @@
       <w:pPr>
         <w:jc w:val="both"/>
       </w:pPr>
+      <w:r>
+        <w:rPr>
+          <w:b/>
+          <w:bCs/>
+        </w:rPr>
+        <w:t xml:space="preserve">Response </w:t>
+      </w:r>
+      <w:r>
+        <w:rPr>
+          <w:b/>
+          <w:bCs/>
+        </w:rPr>
+        <w:t>2</w:t>
+      </w:r>
+      <w:r>
+        <w:rPr>
+          <w:b/>
+          <w:bCs/>
+        </w:rPr>
+        <w:t>:</w:t>
+      </w:r>
+      <w:r>
+        <w:rPr>
+          <w:b/>
+          <w:bCs/>
+        </w:rPr>
+        <w:t xml:space="preserve"> </w:t>
+      </w:r>
       <w:r>
         <w:t>We thank the reviewer for this constructive recommendation. We agree that contextualizing the performance of our proposed Multilayer Perceptron (MLP) against alternative baseline architectures is essential for demonstrating the relative speed, complexity, and accuracy trade-offs.</w:t>
       </w:r>
@@ -936,6 +1206,27 @@
         <w:jc w:val="both"/>
       </w:pPr>
       <w:r>
+        <w:rPr>
+          <w:b/>
+          <w:bCs/>
+        </w:rPr>
+        <w:t xml:space="preserve">Comments </w:t>
+      </w:r>
+      <w:r>
+        <w:rPr>
+          <w:b/>
+          <w:bCs/>
+        </w:rPr>
+        <w:t>3</w:t>
+      </w:r>
+      <w:r>
+        <w:rPr>
+          <w:b/>
+          <w:bCs/>
+        </w:rPr>
+        <w:t xml:space="preserve">: </w:t>
+      </w:r>
+      <w:r>
         <w:t>Statistical rigor – Provide standard deviations and significance tests for the 30 training runs (Table 4).</w:t>
       </w:r>
     </w:p>
@@ -959,6 +1250,34 @@
       <w:pPr>
         <w:jc w:val="both"/>
       </w:pPr>
+      <w:r>
+        <w:rPr>
+          <w:b/>
+          <w:bCs/>
+        </w:rPr>
+        <w:t xml:space="preserve">Response </w:t>
+      </w:r>
+      <w:r>
+        <w:rPr>
+          <w:b/>
+          <w:bCs/>
+        </w:rPr>
+        <w:t>3</w:t>
+      </w:r>
+      <w:r>
+        <w:rPr>
+          <w:b/>
+          <w:bCs/>
+        </w:rPr>
+        <w:t>:</w:t>
+      </w:r>
+      <w:r>
+        <w:rPr>
+          <w:b/>
+          <w:bCs/>
+        </w:rPr>
+        <w:t xml:space="preserve"> </w:t>
+      </w:r>
       <w:r>
         <w:t>We thank the reviewer for this excellent recommendation. Ensuring that observed differences across different configurations are mathematically sound</w:t>
       </w:r>
@@ -1027,6 +1346,27 @@
         <w:jc w:val="both"/>
       </w:pPr>
       <w:r>
+        <w:rPr>
+          <w:b/>
+          <w:bCs/>
+        </w:rPr>
+        <w:t xml:space="preserve">Comments </w:t>
+      </w:r>
+      <w:r>
+        <w:rPr>
+          <w:b/>
+          <w:bCs/>
+        </w:rPr>
+        <w:t>4</w:t>
+      </w:r>
+      <w:r>
+        <w:rPr>
+          <w:b/>
+          <w:bCs/>
+        </w:rPr>
+        <w:t xml:space="preserve">: </w:t>
+      </w:r>
+      <w:r>
         <w:t>Data preprocessing – Clarify the source of the extra 110k benign samples. Downsample only the training set to avoid leakage.</w:t>
       </w:r>
     </w:p>
@@ -1050,6 +1390,34 @@
       <w:pPr>
         <w:jc w:val="both"/>
       </w:pPr>
+      <w:r>
+        <w:rPr>
+          <w:b/>
+          <w:bCs/>
+        </w:rPr>
+        <w:t xml:space="preserve">Response </w:t>
+      </w:r>
+      <w:r>
+        <w:rPr>
+          <w:b/>
+          <w:bCs/>
+        </w:rPr>
+        <w:t>4</w:t>
+      </w:r>
+      <w:r>
+        <w:rPr>
+          <w:b/>
+          <w:bCs/>
+        </w:rPr>
+        <w:t>:</w:t>
+      </w:r>
+      <w:r>
+        <w:rPr>
+          <w:b/>
+          <w:bCs/>
+        </w:rPr>
+        <w:t xml:space="preserve"> </w:t>
+      </w:r>
       <w:r>
         <w:t>We thank the reviewer for this constructive feedback regarding our data preprocessing workflow, dataset composition, and the prevention of data leakage. We have revised the corresponding paragraph in Section 4 to address these points directly.</w:t>
       </w:r>
@@ -1154,6 +1522,27 @@
         <w:jc w:val="both"/>
       </w:pPr>
       <w:r>
+        <w:rPr>
+          <w:b/>
+          <w:bCs/>
+        </w:rPr>
+        <w:t xml:space="preserve">Comments </w:t>
+      </w:r>
+      <w:r>
+        <w:rPr>
+          <w:b/>
+          <w:bCs/>
+        </w:rPr>
+        <w:t>5</w:t>
+      </w:r>
+      <w:r>
+        <w:rPr>
+          <w:b/>
+          <w:bCs/>
+        </w:rPr>
+        <w:t xml:space="preserve">: </w:t>
+      </w:r>
+      <w:r>
         <w:t>Reproducibility – Release code, random seeds, and exact library versions.</w:t>
       </w:r>
     </w:p>
@@ -1177,6 +1566,34 @@
       <w:pPr>
         <w:jc w:val="both"/>
       </w:pPr>
+      <w:r>
+        <w:rPr>
+          <w:b/>
+          <w:bCs/>
+        </w:rPr>
+        <w:t xml:space="preserve">Response </w:t>
+      </w:r>
+      <w:r>
+        <w:rPr>
+          <w:b/>
+          <w:bCs/>
+        </w:rPr>
+        <w:t>5</w:t>
+      </w:r>
+      <w:r>
+        <w:rPr>
+          <w:b/>
+          <w:bCs/>
+        </w:rPr>
+        <w:t>:</w:t>
+      </w:r>
+      <w:r>
+        <w:rPr>
+          <w:b/>
+          <w:bCs/>
+        </w:rPr>
+        <w:t xml:space="preserve"> </w:t>
+      </w:r>
       <w:r>
         <w:t>We thank the reviewer for emphasizing reproducibility, which is a cornerstone of rigorous scientific and engineering research. We fully agree that providing complete technical specifications is essential for validating and reproducing our experimental results. To address the reviewer's request and guarantee reproducibility, we have taken the following actions:</w:t>
       </w:r>
@@ -1228,6 +1645,27 @@
         <w:jc w:val="both"/>
       </w:pPr>
       <w:r>
+        <w:rPr>
+          <w:b/>
+          <w:bCs/>
+        </w:rPr>
+        <w:t xml:space="preserve">Comments </w:t>
+      </w:r>
+      <w:r>
+        <w:rPr>
+          <w:b/>
+          <w:bCs/>
+        </w:rPr>
+        <w:t>6</w:t>
+      </w:r>
+      <w:r>
+        <w:rPr>
+          <w:b/>
+          <w:bCs/>
+        </w:rPr>
+        <w:t xml:space="preserve">: </w:t>
+      </w:r>
+      <w:r>
         <w:t>Acknowledge that latency figures are A100</w:t>
       </w:r>
       <w:r>
@@ -1269,6 +1707,34 @@
       <w:pPr>
         <w:jc w:val="both"/>
       </w:pPr>
+      <w:r>
+        <w:rPr>
+          <w:b/>
+          <w:bCs/>
+        </w:rPr>
+        <w:t xml:space="preserve">Response </w:t>
+      </w:r>
+      <w:r>
+        <w:rPr>
+          <w:b/>
+          <w:bCs/>
+        </w:rPr>
+        <w:t>6</w:t>
+      </w:r>
+      <w:r>
+        <w:rPr>
+          <w:b/>
+          <w:bCs/>
+        </w:rPr>
+        <w:t>:</w:t>
+      </w:r>
+      <w:r>
+        <w:rPr>
+          <w:b/>
+          <w:bCs/>
+        </w:rPr>
+        <w:t xml:space="preserve"> </w:t>
+      </w:r>
       <w:r>
         <w:t>We thank the reviewer for this constructive suggestion. We fully agree that explicitly outlining the hardware-dependency of our benchmarks is vital for providing a balanced, transparent, and scientifically rigorous context for our results.</w:t>
       </w:r>

</xml_diff>